<commit_message>
feat: adjust skill proficiency levels (ML/DL/CV=5 with 3+ yrs, baseline=4, Java/SQL/Cloud/Docker/BE/FE/NLP=3)
</commit_message>
<xml_diff>
--- a/BSOL_Senior-AI-Engineer_Nguyen-Xuan-Cuong.docx
+++ b/BSOL_Senior-AI-Engineer_Nguyen-Xuan-Cuong.docx
@@ -2684,7 +2684,7 @@
           <w:rFonts w:ascii="Calibri" w:cs="Calibri" w:eastAsia="Calibri" w:hAnsi="Calibri"/>
           <w:rtl w:val="0"/>
         </w:rPr>
-        <w:t>: Python (Core/Expert), C++, TypeScript, JavaScript, SQL, Shell Script.</w:t>
+        <w:t>: Python (Core/Expert), C++, Java, TypeScript, JavaScript, SQL, Shell Script.</w:t>
       </w:r>
       <w:r>
         <w:rPr>
@@ -2728,7 +2728,7 @@
           <w:rFonts w:ascii="Calibri" w:cs="Calibri" w:eastAsia="Calibri" w:hAnsi="Calibri"/>
           <w:rtl w:val="0"/>
         </w:rPr>
-        <w:t>: PyTorch, TensorFlow, LangChain, LangGraph, Mastra, FastAPI, Celery, Node.js, Next.js, React, vLLM, Ollama, YOLOv8/v10, MediaPipe.</w:t>
+        <w:t>: PyTorch, TensorFlow, LangChain, LangGraph, Mastra, FastAPI, Celery, Node.js, Next.js, ReactJS, vLLM, Ollama, YOLOv8/v10, MediaPipe.</w:t>
       </w:r>
     </w:p>
     <w:p>
@@ -3959,7 +3959,7 @@
                 <w:rFonts w:ascii="Calibri" w:cs="Calibri" w:eastAsia="Calibri" w:hAnsi="Calibri"/>
                 <w:rtl w:val="0"/>
               </w:rPr>
-              <w:t>5-Recognized authority</w:t>
+              <w:t>4-Applied theory</w:t>
             </w:r>
           </w:p>
         </w:tc>
@@ -4139,7 +4139,7 @@
                 <w:rFonts w:ascii="Calibri" w:cs="Calibri" w:eastAsia="Calibri" w:hAnsi="Calibri"/>
                 <w:rtl w:val="0"/>
               </w:rPr>
-              <w:t>TypeScript / JavaScript</w:t>
+              <w:t>Java</w:t>
             </w:r>
           </w:p>
         </w:tc>
@@ -4157,7 +4157,7 @@
                 <w:rFonts w:ascii="Calibri" w:cs="Calibri" w:eastAsia="Calibri" w:hAnsi="Calibri"/>
                 <w:rtl w:val="0"/>
               </w:rPr>
-              <w:t>4-Applied theory</w:t>
+              <w:t>3-Practical application</w:t>
             </w:r>
           </w:p>
         </w:tc>
@@ -4176,7 +4176,7 @@
                 <w:rFonts w:ascii="Calibri" w:cs="Calibri" w:eastAsia="Calibri" w:hAnsi="Calibri"/>
                 <w:rtl w:val="0"/>
               </w:rPr>
-              <w:t>4+ years</w:t>
+              <w:t>3+ years</w:t>
             </w:r>
           </w:p>
         </w:tc>
@@ -4195,7 +4195,7 @@
                 <w:rFonts w:ascii="Calibri" w:cs="Calibri" w:eastAsia="Calibri" w:hAnsi="Calibri"/>
                 <w:rtl w:val="0"/>
               </w:rPr>
-              <w:t>2026</w:t>
+              <w:t>2025</w:t>
             </w:r>
           </w:p>
         </w:tc>
@@ -4213,7 +4213,7 @@
               <w:rPr>
                 <w:rtl w:val="0"/>
               </w:rPr>
-              <w:t>Full-stack Next.js, React, Node.js applications</w:t>
+              <w:t>OOP, backend services &amp; core data structures</w:t>
             </w:r>
           </w:p>
         </w:tc>
@@ -4238,7 +4238,7 @@
                 <w:rFonts w:ascii="Calibri" w:cs="Calibri" w:eastAsia="Calibri" w:hAnsi="Calibri"/>
                 <w:rtl w:val="0"/>
               </w:rPr>
-              <w:t>SQL</w:t>
+              <w:t>JavaScript / TypeScript</w:t>
             </w:r>
           </w:p>
         </w:tc>
@@ -4256,7 +4256,7 @@
                 <w:rFonts w:ascii="Calibri" w:cs="Calibri" w:eastAsia="Calibri" w:hAnsi="Calibri"/>
                 <w:rtl w:val="0"/>
               </w:rPr>
-              <w:t>4-Applied theory</w:t>
+              <w:t>3-Practical application</w:t>
             </w:r>
           </w:p>
         </w:tc>
@@ -4275,7 +4275,7 @@
                 <w:rFonts w:ascii="Calibri" w:cs="Calibri" w:eastAsia="Calibri" w:hAnsi="Calibri"/>
                 <w:rtl w:val="0"/>
               </w:rPr>
-              <w:t>5 years</w:t>
+              <w:t>3+ years</w:t>
             </w:r>
           </w:p>
         </w:tc>
@@ -4312,7 +4312,106 @@
               <w:rPr>
                 <w:rtl w:val="0"/>
               </w:rPr>
-              <w:t>Relational queries, pgvector indexing &amp; data modeling</w:t>
+              <w:t>Full-stack development, async runtime &amp; APIs</w:t>
+            </w:r>
+          </w:p>
+        </w:tc>
+      </w:tr>
+      <w:tr>
+        <w:trPr>
+          <w:cantSplit w:val="0"/>
+          <w:trHeight w:val="264" w:hRule="atLeast"/>
+          <w:tblHeader w:val="0"/>
+        </w:trPr>
+        <w:tc>
+          <w:tcPr/>
+          <w:p>
+            <w:pPr>
+              <w:spacing w:after="10" w:before="10" w:lineRule="auto"/>
+              <w:rPr>
+                <w:rFonts w:ascii="Calibri" w:cs="Calibri" w:eastAsia="Calibri" w:hAnsi="Calibri"/>
+              </w:rPr>
+            </w:pPr>
+            <w:r>
+              <w:rPr>
+                <w:rFonts w:ascii="Calibri" w:cs="Calibri" w:eastAsia="Calibri" w:hAnsi="Calibri"/>
+                <w:rtl w:val="0"/>
+              </w:rPr>
+              <w:t>SQL</w:t>
+            </w:r>
+          </w:p>
+        </w:tc>
+        <w:tc>
+          <w:tcPr/>
+          <w:p>
+            <w:pPr>
+              <w:spacing w:after="10" w:before="10" w:lineRule="auto"/>
+              <w:rPr>
+                <w:rFonts w:ascii="Calibri" w:cs="Calibri" w:eastAsia="Calibri" w:hAnsi="Calibri"/>
+              </w:rPr>
+            </w:pPr>
+            <w:r>
+              <w:rPr>
+                <w:rFonts w:ascii="Calibri" w:cs="Calibri" w:eastAsia="Calibri" w:hAnsi="Calibri"/>
+                <w:rtl w:val="0"/>
+              </w:rPr>
+              <w:t>3-Practical application</w:t>
+            </w:r>
+          </w:p>
+        </w:tc>
+        <w:tc>
+          <w:tcPr/>
+          <w:p>
+            <w:pPr>
+              <w:spacing w:after="10" w:before="10" w:lineRule="auto"/>
+              <w:jc w:val="center"/>
+              <w:rPr>
+                <w:rFonts w:ascii="Calibri" w:cs="Calibri" w:eastAsia="Calibri" w:hAnsi="Calibri"/>
+              </w:rPr>
+            </w:pPr>
+            <w:r>
+              <w:rPr>
+                <w:rFonts w:ascii="Calibri" w:cs="Calibri" w:eastAsia="Calibri" w:hAnsi="Calibri"/>
+                <w:rtl w:val="0"/>
+              </w:rPr>
+              <w:t>4+ years</w:t>
+            </w:r>
+          </w:p>
+        </w:tc>
+        <w:tc>
+          <w:tcPr/>
+          <w:p>
+            <w:pPr>
+              <w:spacing w:after="10" w:before="10" w:lineRule="auto"/>
+              <w:jc w:val="center"/>
+              <w:rPr>
+                <w:rFonts w:ascii="Calibri" w:cs="Calibri" w:eastAsia="Calibri" w:hAnsi="Calibri"/>
+              </w:rPr>
+            </w:pPr>
+            <w:r>
+              <w:rPr>
+                <w:rFonts w:ascii="Calibri" w:cs="Calibri" w:eastAsia="Calibri" w:hAnsi="Calibri"/>
+                <w:rtl w:val="0"/>
+              </w:rPr>
+              <w:t>2026</w:t>
+            </w:r>
+          </w:p>
+        </w:tc>
+        <w:tc>
+          <w:tcPr/>
+          <w:p>
+            <w:pPr>
+              <w:spacing w:after="10" w:before="10" w:lineRule="auto"/>
+              <w:jc w:val="both"/>
+              <w:rPr>
+                <w:rFonts w:ascii="Calibri" w:cs="Calibri" w:eastAsia="Calibri" w:hAnsi="Calibri"/>
+              </w:rPr>
+            </w:pPr>
+            <w:r>
+              <w:rPr>
+                <w:rtl w:val="0"/>
+              </w:rPr>
+              <w:t>Relational queries, database indexing &amp; data modeling</w:t>
             </w:r>
           </w:p>
         </w:tc>
@@ -4371,7 +4470,7 @@
                 <w:rFonts w:ascii="Calibri" w:cs="Calibri" w:eastAsia="Calibri" w:hAnsi="Calibri"/>
                 <w:rtl w:val="0"/>
               </w:rPr>
-              <w:t>PyTorch, TensorFlow</w:t>
+              <w:t>Machine Learning (ML)</w:t>
             </w:r>
           </w:p>
         </w:tc>
@@ -4408,7 +4507,7 @@
                 <w:rFonts w:ascii="Calibri" w:cs="Calibri" w:eastAsia="Calibri" w:hAnsi="Calibri"/>
                 <w:rtl w:val="0"/>
               </w:rPr>
-              <w:t>5 years</w:t>
+              <w:t>3+ years</w:t>
             </w:r>
           </w:p>
         </w:tc>
@@ -4445,7 +4544,7 @@
               <w:rPr>
                 <w:rtl w:val="0"/>
               </w:rPr>
-              <w:t>Deep learning research, model training &amp; fine-tuning</w:t>
+              <w:t>Classical ML algorithms, feature engineering &amp; scikit-learn</w:t>
             </w:r>
           </w:p>
         </w:tc>
@@ -4470,7 +4569,7 @@
                 <w:rFonts w:ascii="Calibri" w:cs="Calibri" w:eastAsia="Calibri" w:hAnsi="Calibri"/>
                 <w:rtl w:val="0"/>
               </w:rPr>
-              <w:t>Computer Vision (YOLOv8/10, MediaPipe, ByteTrack, ViT)</w:t>
+              <w:t>Deep Learning (DL - PyTorch, TensorFlow)</w:t>
             </w:r>
           </w:p>
         </w:tc>
@@ -4488,7 +4587,7 @@
                 <w:rFonts w:ascii="Calibri" w:cs="Calibri" w:eastAsia="Calibri" w:hAnsi="Calibri"/>
                 <w:rtl w:val="0"/>
               </w:rPr>
-              <w:t>4-Applied theory</w:t>
+              <w:t>5-Recognized authority</w:t>
             </w:r>
           </w:p>
         </w:tc>
@@ -4507,7 +4606,7 @@
                 <w:rFonts w:ascii="Calibri" w:cs="Calibri" w:eastAsia="Calibri" w:hAnsi="Calibri"/>
                 <w:rtl w:val="0"/>
               </w:rPr>
-              <w:t>4+ years</w:t>
+              <w:t>3+ years</w:t>
             </w:r>
           </w:p>
         </w:tc>
@@ -4544,7 +4643,205 @@
               <w:rPr>
                 <w:rtl w:val="0"/>
               </w:rPr>
-              <w:t>Real-time object detection, tracking &amp; pose analysis</w:t>
+              <w:t>Neural architecture design, model training &amp; fine-tuning</w:t>
+            </w:r>
+          </w:p>
+        </w:tc>
+      </w:tr>
+      <w:tr>
+        <w:trPr>
+          <w:cantSplit w:val="0"/>
+          <w:trHeight w:val="264" w:hRule="atLeast"/>
+          <w:tblHeader w:val="0"/>
+        </w:trPr>
+        <w:tc>
+          <w:tcPr/>
+          <w:p>
+            <w:pPr>
+              <w:spacing w:after="10" w:before="10" w:lineRule="auto"/>
+              <w:rPr>
+                <w:rFonts w:ascii="Calibri" w:cs="Calibri" w:eastAsia="Calibri" w:hAnsi="Calibri"/>
+              </w:rPr>
+            </w:pPr>
+            <w:r>
+              <w:rPr>
+                <w:rFonts w:ascii="Calibri" w:cs="Calibri" w:eastAsia="Calibri" w:hAnsi="Calibri"/>
+                <w:rtl w:val="0"/>
+              </w:rPr>
+              <w:t>Computer Vision (CV - YOLO, MediaPipe, ViT)</w:t>
+            </w:r>
+          </w:p>
+        </w:tc>
+        <w:tc>
+          <w:tcPr/>
+          <w:p>
+            <w:pPr>
+              <w:spacing w:after="10" w:before="10" w:lineRule="auto"/>
+              <w:rPr>
+                <w:rFonts w:ascii="Calibri" w:cs="Calibri" w:eastAsia="Calibri" w:hAnsi="Calibri"/>
+              </w:rPr>
+            </w:pPr>
+            <w:r>
+              <w:rPr>
+                <w:rFonts w:ascii="Calibri" w:cs="Calibri" w:eastAsia="Calibri" w:hAnsi="Calibri"/>
+                <w:rtl w:val="0"/>
+              </w:rPr>
+              <w:t>5-Recognized authority</w:t>
+            </w:r>
+          </w:p>
+        </w:tc>
+        <w:tc>
+          <w:tcPr/>
+          <w:p>
+            <w:pPr>
+              <w:spacing w:after="10" w:before="10" w:lineRule="auto"/>
+              <w:jc w:val="center"/>
+              <w:rPr>
+                <w:rFonts w:ascii="Calibri" w:cs="Calibri" w:eastAsia="Calibri" w:hAnsi="Calibri"/>
+              </w:rPr>
+            </w:pPr>
+            <w:r>
+              <w:rPr>
+                <w:rFonts w:ascii="Calibri" w:cs="Calibri" w:eastAsia="Calibri" w:hAnsi="Calibri"/>
+                <w:rtl w:val="0"/>
+              </w:rPr>
+              <w:t>3+ years</w:t>
+            </w:r>
+          </w:p>
+        </w:tc>
+        <w:tc>
+          <w:tcPr/>
+          <w:p>
+            <w:pPr>
+              <w:spacing w:after="10" w:before="10" w:lineRule="auto"/>
+              <w:jc w:val="center"/>
+              <w:rPr>
+                <w:rFonts w:ascii="Calibri" w:cs="Calibri" w:eastAsia="Calibri" w:hAnsi="Calibri"/>
+              </w:rPr>
+            </w:pPr>
+            <w:r>
+              <w:rPr>
+                <w:rFonts w:ascii="Calibri" w:cs="Calibri" w:eastAsia="Calibri" w:hAnsi="Calibri"/>
+                <w:rtl w:val="0"/>
+              </w:rPr>
+              <w:t>2026</w:t>
+            </w:r>
+          </w:p>
+        </w:tc>
+        <w:tc>
+          <w:tcPr/>
+          <w:p>
+            <w:pPr>
+              <w:spacing w:after="10" w:before="10" w:lineRule="auto"/>
+              <w:jc w:val="both"/>
+              <w:rPr>
+                <w:rFonts w:ascii="Calibri" w:cs="Calibri" w:eastAsia="Calibri" w:hAnsi="Calibri"/>
+              </w:rPr>
+            </w:pPr>
+            <w:r>
+              <w:rPr>
+                <w:rtl w:val="0"/>
+              </w:rPr>
+              <w:t>Real-time object detection, tracking, pose &amp; video analysis</w:t>
+            </w:r>
+          </w:p>
+        </w:tc>
+      </w:tr>
+      <w:tr>
+        <w:trPr>
+          <w:cantSplit w:val="0"/>
+          <w:trHeight w:val="264" w:hRule="atLeast"/>
+          <w:tblHeader w:val="0"/>
+        </w:trPr>
+        <w:tc>
+          <w:tcPr/>
+          <w:p>
+            <w:pPr>
+              <w:spacing w:after="10" w:before="10" w:lineRule="auto"/>
+              <w:rPr>
+                <w:rFonts w:ascii="Calibri" w:cs="Calibri" w:eastAsia="Calibri" w:hAnsi="Calibri"/>
+              </w:rPr>
+            </w:pPr>
+            <w:r>
+              <w:rPr>
+                <w:rFonts w:ascii="Calibri" w:cs="Calibri" w:eastAsia="Calibri" w:hAnsi="Calibri"/>
+                <w:rtl w:val="0"/>
+              </w:rPr>
+              <w:t>Natural Language Processing (NLP)</w:t>
+            </w:r>
+          </w:p>
+        </w:tc>
+        <w:tc>
+          <w:tcPr/>
+          <w:p>
+            <w:pPr>
+              <w:spacing w:after="10" w:before="10" w:lineRule="auto"/>
+              <w:rPr>
+                <w:rFonts w:ascii="Calibri" w:cs="Calibri" w:eastAsia="Calibri" w:hAnsi="Calibri"/>
+              </w:rPr>
+            </w:pPr>
+            <w:r>
+              <w:rPr>
+                <w:rFonts w:ascii="Calibri" w:cs="Calibri" w:eastAsia="Calibri" w:hAnsi="Calibri"/>
+                <w:rtl w:val="0"/>
+              </w:rPr>
+              <w:t>3-Practical application</w:t>
+            </w:r>
+          </w:p>
+        </w:tc>
+        <w:tc>
+          <w:tcPr/>
+          <w:p>
+            <w:pPr>
+              <w:spacing w:after="10" w:before="10" w:lineRule="auto"/>
+              <w:jc w:val="center"/>
+              <w:rPr>
+                <w:rFonts w:ascii="Calibri" w:cs="Calibri" w:eastAsia="Calibri" w:hAnsi="Calibri"/>
+              </w:rPr>
+            </w:pPr>
+            <w:r>
+              <w:rPr>
+                <w:rFonts w:ascii="Calibri" w:cs="Calibri" w:eastAsia="Calibri" w:hAnsi="Calibri"/>
+                <w:rtl w:val="0"/>
+              </w:rPr>
+              <w:t>3+ years</w:t>
+            </w:r>
+          </w:p>
+        </w:tc>
+        <w:tc>
+          <w:tcPr/>
+          <w:p>
+            <w:pPr>
+              <w:spacing w:after="10" w:before="10" w:lineRule="auto"/>
+              <w:jc w:val="center"/>
+              <w:rPr>
+                <w:rFonts w:ascii="Calibri" w:cs="Calibri" w:eastAsia="Calibri" w:hAnsi="Calibri"/>
+              </w:rPr>
+            </w:pPr>
+            <w:r>
+              <w:rPr>
+                <w:rFonts w:ascii="Calibri" w:cs="Calibri" w:eastAsia="Calibri" w:hAnsi="Calibri"/>
+                <w:rtl w:val="0"/>
+              </w:rPr>
+              <w:t>2026</w:t>
+            </w:r>
+          </w:p>
+        </w:tc>
+        <w:tc>
+          <w:tcPr/>
+          <w:p>
+            <w:pPr>
+              <w:spacing w:after="10" w:before="10" w:lineRule="auto"/>
+              <w:jc w:val="both"/>
+              <w:rPr>
+                <w:rFonts w:ascii="Calibri" w:cs="Calibri" w:eastAsia="Calibri" w:hAnsi="Calibri"/>
+              </w:rPr>
+            </w:pPr>
+            <w:r>
+              <w:rPr>
+                <w:rtl w:val="0"/>
+              </w:rPr>
+              <w:t>Text preprocessing, tokenization, semantic embeddings &amp; classification</w:t>
             </w:r>
           </w:p>
         </w:tc>
@@ -4621,7 +4918,7 @@
                 <w:rFonts w:ascii="Calibri" w:cs="Calibri" w:eastAsia="Calibri" w:hAnsi="Calibri"/>
                 <w:rtl w:val="0"/>
               </w:rPr>
-              <w:t>5-Recognized authority</w:t>
+              <w:t>4-Applied theory</w:t>
             </w:r>
           </w:p>
         </w:tc>
@@ -4909,7 +5206,7 @@
                 <w:bCs w:val="1"/>
                 <w:rtl w:val="0"/>
               </w:rPr>
-              <w:t>Backend, Distributed Systems &amp; Database</w:t>
+              <w:t>Backend, Frontend &amp; Database</w:t>
             </w:r>
           </w:p>
         </w:tc>
@@ -4934,7 +5231,7 @@
                 <w:rFonts w:ascii="Calibri" w:cs="Calibri" w:eastAsia="Calibri" w:hAnsi="Calibri"/>
                 <w:rtl w:val="0"/>
               </w:rPr>
-              <w:t>FastAPI, Node.js, REST APIs</w:t>
+              <w:t>FastAPI (Python Backend)</w:t>
             </w:r>
           </w:p>
         </w:tc>
@@ -5008,7 +5305,7 @@
               <w:rPr>
                 <w:rtl w:val="0"/>
               </w:rPr>
-              <w:t>High-throughput, asynchronous microservices</w:t>
+              <w:t>High-throughput, asynchronous microservices &amp; APIs</w:t>
             </w:r>
           </w:p>
         </w:tc>
@@ -5033,7 +5330,7 @@
                 <w:rFonts w:ascii="Calibri" w:cs="Calibri" w:eastAsia="Calibri" w:hAnsi="Calibri"/>
                 <w:rtl w:val="0"/>
               </w:rPr>
-              <w:t>Redis (AOF), Celery, WebSockets, WebRTC</w:t>
+              <w:t>Node.js (Backend)</w:t>
             </w:r>
           </w:p>
         </w:tc>
@@ -5051,7 +5348,7 @@
                 <w:rFonts w:ascii="Calibri" w:cs="Calibri" w:eastAsia="Calibri" w:hAnsi="Calibri"/>
                 <w:rtl w:val="0"/>
               </w:rPr>
-              <w:t>4-Applied theory</w:t>
+              <w:t>3-Practical application</w:t>
             </w:r>
           </w:p>
         </w:tc>
@@ -5107,7 +5404,7 @@
               <w:rPr>
                 <w:rtl w:val="0"/>
               </w:rPr>
-              <w:t>Distributed worker queues, real-time streaming</w:t>
+              <w:t>Event-driven backend services &amp; RESTful APIs</w:t>
             </w:r>
           </w:p>
         </w:tc>
@@ -5132,7 +5429,7 @@
                 <w:rFonts w:ascii="Calibri" w:cs="Calibri" w:eastAsia="Calibri" w:hAnsi="Calibri"/>
                 <w:rtl w:val="0"/>
               </w:rPr>
-              <w:t>PostgreSQL / Supabase</w:t>
+              <w:t>ReactJS / Next.js (Frontend)</w:t>
             </w:r>
           </w:p>
         </w:tc>
@@ -5150,7 +5447,7 @@
                 <w:rFonts w:ascii="Calibri" w:cs="Calibri" w:eastAsia="Calibri" w:hAnsi="Calibri"/>
                 <w:rtl w:val="0"/>
               </w:rPr>
-              <w:t>4-Applied theory</w:t>
+              <w:t>3-Practical application</w:t>
             </w:r>
           </w:p>
         </w:tc>
@@ -5169,7 +5466,7 @@
                 <w:rFonts w:ascii="Calibri" w:cs="Calibri" w:eastAsia="Calibri" w:hAnsi="Calibri"/>
                 <w:rtl w:val="0"/>
               </w:rPr>
-              <w:t>4+ years</w:t>
+              <w:t>3+ years</w:t>
             </w:r>
           </w:p>
         </w:tc>
@@ -5206,7 +5503,205 @@
               <w:rPr>
                 <w:rtl w:val="0"/>
               </w:rPr>
-              <w:t>Relational data, authentication, vector storage</w:t>
+              <w:t>Component-based SPA, SSR &amp; interactive dashboards</w:t>
+            </w:r>
+          </w:p>
+        </w:tc>
+      </w:tr>
+      <w:tr>
+        <w:trPr>
+          <w:cantSplit w:val="0"/>
+          <w:trHeight w:val="264" w:hRule="atLeast"/>
+          <w:tblHeader w:val="0"/>
+        </w:trPr>
+        <w:tc>
+          <w:tcPr/>
+          <w:p>
+            <w:pPr>
+              <w:spacing w:after="10" w:before="10" w:lineRule="auto"/>
+              <w:rPr>
+                <w:rFonts w:ascii="Calibri" w:cs="Calibri" w:eastAsia="Calibri" w:hAnsi="Calibri"/>
+              </w:rPr>
+            </w:pPr>
+            <w:r>
+              <w:rPr>
+                <w:rFonts w:ascii="Calibri" w:cs="Calibri" w:eastAsia="Calibri" w:hAnsi="Calibri"/>
+                <w:rtl w:val="0"/>
+              </w:rPr>
+              <w:t>Redis (AOF), Celery, WebSockets, WebRTC</w:t>
+            </w:r>
+          </w:p>
+        </w:tc>
+        <w:tc>
+          <w:tcPr/>
+          <w:p>
+            <w:pPr>
+              <w:spacing w:after="10" w:before="10" w:lineRule="auto"/>
+              <w:rPr>
+                <w:rFonts w:ascii="Calibri" w:cs="Calibri" w:eastAsia="Calibri" w:hAnsi="Calibri"/>
+              </w:rPr>
+            </w:pPr>
+            <w:r>
+              <w:rPr>
+                <w:rFonts w:ascii="Calibri" w:cs="Calibri" w:eastAsia="Calibri" w:hAnsi="Calibri"/>
+                <w:rtl w:val="0"/>
+              </w:rPr>
+              <w:t>4-Applied theory</w:t>
+            </w:r>
+          </w:p>
+        </w:tc>
+        <w:tc>
+          <w:tcPr/>
+          <w:p>
+            <w:pPr>
+              <w:spacing w:after="10" w:before="10" w:lineRule="auto"/>
+              <w:jc w:val="center"/>
+              <w:rPr>
+                <w:rFonts w:ascii="Calibri" w:cs="Calibri" w:eastAsia="Calibri" w:hAnsi="Calibri"/>
+              </w:rPr>
+            </w:pPr>
+            <w:r>
+              <w:rPr>
+                <w:rFonts w:ascii="Calibri" w:cs="Calibri" w:eastAsia="Calibri" w:hAnsi="Calibri"/>
+                <w:rtl w:val="0"/>
+              </w:rPr>
+              <w:t>3+ years</w:t>
+            </w:r>
+          </w:p>
+        </w:tc>
+        <w:tc>
+          <w:tcPr/>
+          <w:p>
+            <w:pPr>
+              <w:spacing w:after="10" w:before="10" w:lineRule="auto"/>
+              <w:jc w:val="center"/>
+              <w:rPr>
+                <w:rFonts w:ascii="Calibri" w:cs="Calibri" w:eastAsia="Calibri" w:hAnsi="Calibri"/>
+              </w:rPr>
+            </w:pPr>
+            <w:r>
+              <w:rPr>
+                <w:rFonts w:ascii="Calibri" w:cs="Calibri" w:eastAsia="Calibri" w:hAnsi="Calibri"/>
+                <w:rtl w:val="0"/>
+              </w:rPr>
+              <w:t>2026</w:t>
+            </w:r>
+          </w:p>
+        </w:tc>
+        <w:tc>
+          <w:tcPr/>
+          <w:p>
+            <w:pPr>
+              <w:spacing w:after="10" w:before="10" w:lineRule="auto"/>
+              <w:jc w:val="both"/>
+              <w:rPr>
+                <w:rFonts w:ascii="Calibri" w:cs="Calibri" w:eastAsia="Calibri" w:hAnsi="Calibri"/>
+              </w:rPr>
+            </w:pPr>
+            <w:r>
+              <w:rPr>
+                <w:rtl w:val="0"/>
+              </w:rPr>
+              <w:t>Distributed worker queues, real-time media streaming</w:t>
+            </w:r>
+          </w:p>
+        </w:tc>
+      </w:tr>
+      <w:tr>
+        <w:trPr>
+          <w:cantSplit w:val="0"/>
+          <w:trHeight w:val="264" w:hRule="atLeast"/>
+          <w:tblHeader w:val="0"/>
+        </w:trPr>
+        <w:tc>
+          <w:tcPr/>
+          <w:p>
+            <w:pPr>
+              <w:spacing w:after="10" w:before="10" w:lineRule="auto"/>
+              <w:rPr>
+                <w:rFonts w:ascii="Calibri" w:cs="Calibri" w:eastAsia="Calibri" w:hAnsi="Calibri"/>
+              </w:rPr>
+            </w:pPr>
+            <w:r>
+              <w:rPr>
+                <w:rFonts w:ascii="Calibri" w:cs="Calibri" w:eastAsia="Calibri" w:hAnsi="Calibri"/>
+                <w:rtl w:val="0"/>
+              </w:rPr>
+              <w:t>PostgreSQL / Supabase</w:t>
+            </w:r>
+          </w:p>
+        </w:tc>
+        <w:tc>
+          <w:tcPr/>
+          <w:p>
+            <w:pPr>
+              <w:spacing w:after="10" w:before="10" w:lineRule="auto"/>
+              <w:rPr>
+                <w:rFonts w:ascii="Calibri" w:cs="Calibri" w:eastAsia="Calibri" w:hAnsi="Calibri"/>
+              </w:rPr>
+            </w:pPr>
+            <w:r>
+              <w:rPr>
+                <w:rFonts w:ascii="Calibri" w:cs="Calibri" w:eastAsia="Calibri" w:hAnsi="Calibri"/>
+                <w:rtl w:val="0"/>
+              </w:rPr>
+              <w:t>4-Applied theory</w:t>
+            </w:r>
+          </w:p>
+        </w:tc>
+        <w:tc>
+          <w:tcPr/>
+          <w:p>
+            <w:pPr>
+              <w:spacing w:after="10" w:before="10" w:lineRule="auto"/>
+              <w:jc w:val="center"/>
+              <w:rPr>
+                <w:rFonts w:ascii="Calibri" w:cs="Calibri" w:eastAsia="Calibri" w:hAnsi="Calibri"/>
+              </w:rPr>
+            </w:pPr>
+            <w:r>
+              <w:rPr>
+                <w:rFonts w:ascii="Calibri" w:cs="Calibri" w:eastAsia="Calibri" w:hAnsi="Calibri"/>
+                <w:rtl w:val="0"/>
+              </w:rPr>
+              <w:t>4+ years</w:t>
+            </w:r>
+          </w:p>
+        </w:tc>
+        <w:tc>
+          <w:tcPr/>
+          <w:p>
+            <w:pPr>
+              <w:spacing w:after="10" w:before="10" w:lineRule="auto"/>
+              <w:jc w:val="center"/>
+              <w:rPr>
+                <w:rFonts w:ascii="Calibri" w:cs="Calibri" w:eastAsia="Calibri" w:hAnsi="Calibri"/>
+              </w:rPr>
+            </w:pPr>
+            <w:r>
+              <w:rPr>
+                <w:rFonts w:ascii="Calibri" w:cs="Calibri" w:eastAsia="Calibri" w:hAnsi="Calibri"/>
+                <w:rtl w:val="0"/>
+              </w:rPr>
+              <w:t>2026</w:t>
+            </w:r>
+          </w:p>
+        </w:tc>
+        <w:tc>
+          <w:tcPr/>
+          <w:p>
+            <w:pPr>
+              <w:spacing w:after="10" w:before="10" w:lineRule="auto"/>
+              <w:jc w:val="both"/>
+              <w:rPr>
+                <w:rFonts w:ascii="Calibri" w:cs="Calibri" w:eastAsia="Calibri" w:hAnsi="Calibri"/>
+              </w:rPr>
+            </w:pPr>
+            <w:r>
+              <w:rPr>
+                <w:rtl w:val="0"/>
+              </w:rPr>
+              <w:t>Relational data, authentication, pgvector storage</w:t>
             </w:r>
           </w:p>
         </w:tc>
@@ -5283,7 +5778,7 @@
                 <w:rFonts w:ascii="Calibri" w:cs="Calibri" w:eastAsia="Calibri" w:hAnsi="Calibri"/>
                 <w:rtl w:val="0"/>
               </w:rPr>
-              <w:t>4-Applied theory</w:t>
+              <w:t>3-Practical application</w:t>
             </w:r>
           </w:p>
         </w:tc>
@@ -5302,7 +5797,7 @@
                 <w:rFonts w:ascii="Calibri" w:cs="Calibri" w:eastAsia="Calibri" w:hAnsi="Calibri"/>
                 <w:rtl w:val="0"/>
               </w:rPr>
-              <w:t>4+ years</w:t>
+              <w:t>3+ years</w:t>
             </w:r>
           </w:p>
         </w:tc>
@@ -5382,7 +5877,7 @@
                 <w:rFonts w:ascii="Calibri" w:cs="Calibri" w:eastAsia="Calibri" w:hAnsi="Calibri"/>
                 <w:rtl w:val="0"/>
               </w:rPr>
-              <w:t>4-Applied theory</w:t>
+              <w:t>3-Practical application</w:t>
             </w:r>
           </w:p>
         </w:tc>
@@ -5401,7 +5896,7 @@
                 <w:rFonts w:ascii="Calibri" w:cs="Calibri" w:eastAsia="Calibri" w:hAnsi="Calibri"/>
                 <w:rtl w:val="0"/>
               </w:rPr>
-              <w:t>4+ years</w:t>
+              <w:t>3+ years</w:t>
             </w:r>
           </w:p>
         </w:tc>
@@ -5438,7 +5933,7 @@
               <w:rPr>
                 <w:rtl w:val="0"/>
               </w:rPr>
-              <w:t>Cloud deployment, GPU serverless runtime</w:t>
+              <w:t>Cloud deployment, GPU serverless runtime &amp; infrastructure</w:t>
             </w:r>
           </w:p>
         </w:tc>

</xml_diff>